<commit_message>
docs: structure report strictly into phased milestones with milestone 3 in-progress for final defense
</commit_message>
<xml_diff>
--- a/docs/SAGRI_BENNETT_OFFICIAL_LAB_REPORT.docx
+++ b/docs/SAGRI_BENNETT_OFFICIAL_LAB_REPORT.docx
@@ -14,7 +14,7 @@
           <w:color w:val="0D5C3A"/>
           <w:sz w:val="40"/>
         </w:rPr>
-        <w:t>Project Report: SAGRI (Smart Agriculture and Krishi Sahayak)</w:t>
+        <w:t>Progressive Laboratory Evaluation Report: SAGRI (Krishi Sahayak)</w:t>
       </w:r>
     </w:p>
     <w:p>
@@ -29,7 +29,7 @@
           <w:color w:val="1E3A8A"/>
           <w:sz w:val="28"/>
         </w:rPr>
-        <w:t>Milestone 1 and Milestone 2 Evaluation Report</w:t>
+        <w:t>Phased Implementation: Milestone 1 &amp; Milestone 2 (Interim Progress Report)</w:t>
       </w:r>
     </w:p>
     <w:p>
@@ -116,7 +116,7 @@
           <w:color w:val="1F2937"/>
           <w:sz w:val="21"/>
         </w:rPr>
-        <w:t>Total Evaluation Weight:</w:t>
+        <w:t>Evaluation Type:</w:t>
       </w:r>
       <w:r>
         <w:rPr>
@@ -124,7 +124,26 @@
           <w:color w:val="1F2937"/>
           <w:sz w:val="21"/>
         </w:rPr>
-        <w:t xml:space="preserve"> 12 Marks</w:t>
+        <w:t xml:space="preserve"> Progressive Phased Lab Evaluation (Milestone 1 &amp; 2 Scope — 12 Marks)</w:t>
+      </w:r>
+    </w:p>
+    <w:p>
+      <w:r>
+        <w:rPr>
+          <w:rFonts w:ascii="Calibri" w:hAnsi="Calibri"/>
+          <w:b/>
+          <w:color w:val="1F2937"/>
+          <w:sz w:val="21"/>
+        </w:rPr>
+        <w:t>Upcoming Final Phase:</w:t>
+      </w:r>
+      <w:r>
+        <w:rPr>
+          <w:rFonts w:ascii="Calibri" w:hAnsi="Calibri"/>
+          <w:color w:val="1F2937"/>
+          <w:sz w:val="21"/>
+        </w:rPr>
+        <w:t xml:space="preserve"> Milestone 3 (Production Hardening, Edge Quantization, IoT Telemetry &amp; Final Defense)</w:t>
       </w:r>
     </w:p>
     <w:p>
@@ -150,7 +169,7 @@
           <w:color w:val="0F172A"/>
           <w:sz w:val="23"/>
         </w:rPr>
-        <w:t>Project Information &amp; Team Details</w:t>
+        <w:t>Project Information &amp; Phased Lifecycle Overview</w:t>
       </w:r>
     </w:p>
     <w:tbl>
@@ -650,6 +669,76 @@
           </w:p>
         </w:tc>
       </w:tr>
+      <w:tr>
+        <w:tc>
+          <w:tcPr>
+            <w:tcW w:type="dxa" w:w="4824"/>
+            <w:tcMar>
+              <w:top w:w="100" w:type="dxa"/>
+              <w:bottom w:w="100" w:type="dxa"/>
+              <w:left w:w="140" w:type="dxa"/>
+              <w:right w:w="140" w:type="dxa"/>
+            </w:tcMar>
+            <w:tcBorders>
+              <w:top w:val="single" w:sz="4" w:space="0" w:color="CBD5E1"/>
+              <w:left w:val="single" w:sz="4" w:space="0" w:color="CBD5E1"/>
+              <w:bottom w:val="single" w:sz="4" w:space="0" w:color="CBD5E1"/>
+              <w:right w:val="single" w:sz="4" w:space="0" w:color="CBD5E1"/>
+              <w:insideH w:val="none"/>
+              <w:insideV w:val="none"/>
+            </w:tcBorders>
+            <w:shd w:fill="F8FAFC"/>
+          </w:tcPr>
+          <w:p>
+            <w:pPr>
+              <w:spacing w:before="40" w:after="40"/>
+            </w:pPr>
+            <w:r>
+              <w:rPr>
+                <w:rFonts w:ascii="Calibri" w:hAnsi="Calibri"/>
+                <w:b/>
+                <w:color w:val="1F2937"/>
+                <w:sz w:val="18"/>
+              </w:rPr>
+              <w:t>Project Lifecycle Stage</w:t>
+            </w:r>
+          </w:p>
+        </w:tc>
+        <w:tc>
+          <w:tcPr>
+            <w:tcW w:type="dxa" w:w="4824"/>
+            <w:tcMar>
+              <w:top w:w="100" w:type="dxa"/>
+              <w:bottom w:w="100" w:type="dxa"/>
+              <w:left w:w="140" w:type="dxa"/>
+              <w:right w:w="140" w:type="dxa"/>
+            </w:tcMar>
+            <w:tcBorders>
+              <w:top w:val="single" w:sz="4" w:space="0" w:color="CBD5E1"/>
+              <w:left w:val="single" w:sz="4" w:space="0" w:color="CBD5E1"/>
+              <w:bottom w:val="single" w:sz="4" w:space="0" w:color="CBD5E1"/>
+              <w:right w:val="single" w:sz="4" w:space="0" w:color="CBD5E1"/>
+              <w:insideH w:val="none"/>
+              <w:insideV w:val="none"/>
+            </w:tcBorders>
+            <w:shd w:fill="F8FAFC"/>
+          </w:tcPr>
+          <w:p>
+            <w:pPr>
+              <w:spacing w:before="40" w:after="40"/>
+            </w:pPr>
+            <w:r>
+              <w:rPr>
+                <w:rFonts w:ascii="Calibri" w:hAnsi="Calibri"/>
+                <w:b/>
+                <w:color w:val="1F2937"/>
+                <w:sz w:val="18"/>
+              </w:rPr>
+              <w:t>Phase 2 of 3 (Milestones 1 &amp; 2 Implemented; Milestone 3 In-Progress)</w:t>
+            </w:r>
+          </w:p>
+        </w:tc>
+      </w:tr>
     </w:tbl>
     <w:p/>
     <w:p>
@@ -809,7 +898,7 @@
                 <w:color w:val="FFFFFF"/>
                 <w:sz w:val="19"/>
               </w:rPr>
-              <w:t>Academic Contribution</w:t>
+              <w:t>Phased Academic Contribution</w:t>
             </w:r>
           </w:p>
         </w:tc>
@@ -1237,6 +1326,620 @@
     </w:p>
     <w:p>
       <w:pPr>
+        <w:pStyle w:val="Heading3"/>
+        <w:spacing w:before="180" w:after="40"/>
+      </w:pPr>
+      <w:r>
+        <w:rPr>
+          <w:rFonts w:ascii="Calibri" w:hAnsi="Calibri"/>
+          <w:b/>
+          <w:color w:val="0F172A"/>
+          <w:sz w:val="23"/>
+        </w:rPr>
+        <w:t>Phased Project Progression Matrix (3-Stage Engineering Roadmap)</w:t>
+      </w:r>
+    </w:p>
+    <w:p>
+      <w:r>
+        <w:rPr>
+          <w:rFonts w:ascii="Calibri" w:hAnsi="Calibri"/>
+          <w:color w:val="1F2937"/>
+          <w:sz w:val="21"/>
+        </w:rPr>
+        <w:t xml:space="preserve">To maintain disciplined systems engineering, our team structured SAGRI across three progressive evaluation milestones. The current evaluation specifically covers </w:t>
+      </w:r>
+      <w:r>
+        <w:rPr>
+          <w:rFonts w:ascii="Calibri" w:hAnsi="Calibri"/>
+          <w:b/>
+          <w:color w:val="1F2937"/>
+          <w:sz w:val="21"/>
+        </w:rPr>
+        <w:t>Milestone 1 and Milestone 2</w:t>
+      </w:r>
+      <w:r>
+        <w:rPr>
+          <w:rFonts w:ascii="Calibri" w:hAnsi="Calibri"/>
+          <w:color w:val="1F2937"/>
+          <w:sz w:val="21"/>
+        </w:rPr>
+        <w:t>:</w:t>
+      </w:r>
+    </w:p>
+    <w:tbl>
+      <w:tblPr>
+        <w:tblW w:type="auto" w:w="0"/>
+        <w:jc w:val="center"/>
+        <w:tblLayout w:type="autofit"/>
+        <w:tblLook w:firstColumn="1" w:firstRow="1" w:lastColumn="0" w:lastRow="0" w:noHBand="0" w:noVBand="1" w:val="04A0"/>
+      </w:tblPr>
+      <w:tblGrid>
+        <w:gridCol w:w="2412"/>
+        <w:gridCol w:w="2412"/>
+        <w:gridCol w:w="2412"/>
+        <w:gridCol w:w="2412"/>
+      </w:tblGrid>
+      <w:tr>
+        <w:tc>
+          <w:tcPr>
+            <w:tcW w:type="dxa" w:w="2412"/>
+            <w:tcMar>
+              <w:top w:w="100" w:type="dxa"/>
+              <w:bottom w:w="100" w:type="dxa"/>
+              <w:left w:w="140" w:type="dxa"/>
+              <w:right w:w="140" w:type="dxa"/>
+            </w:tcMar>
+            <w:tcBorders>
+              <w:top w:val="single" w:sz="4" w:space="0" w:color="CBD5E1"/>
+              <w:left w:val="single" w:sz="4" w:space="0" w:color="CBD5E1"/>
+              <w:bottom w:val="single" w:sz="4" w:space="0" w:color="CBD5E1"/>
+              <w:right w:val="single" w:sz="4" w:space="0" w:color="CBD5E1"/>
+              <w:insideH w:val="none"/>
+              <w:insideV w:val="none"/>
+            </w:tcBorders>
+            <w:shd w:fill="0D5C3A"/>
+          </w:tcPr>
+          <w:p>
+            <w:pPr>
+              <w:spacing w:before="40" w:after="40"/>
+            </w:pPr>
+            <w:r>
+              <w:rPr>
+                <w:rFonts w:ascii="Calibri" w:hAnsi="Calibri"/>
+                <w:b/>
+                <w:color w:val="FFFFFF"/>
+                <w:sz w:val="19"/>
+              </w:rPr>
+              <w:t>Engineering Phase</w:t>
+            </w:r>
+          </w:p>
+        </w:tc>
+        <w:tc>
+          <w:tcPr>
+            <w:tcW w:type="dxa" w:w="2412"/>
+            <w:tcMar>
+              <w:top w:w="100" w:type="dxa"/>
+              <w:bottom w:w="100" w:type="dxa"/>
+              <w:left w:w="140" w:type="dxa"/>
+              <w:right w:w="140" w:type="dxa"/>
+            </w:tcMar>
+            <w:tcBorders>
+              <w:top w:val="single" w:sz="4" w:space="0" w:color="CBD5E1"/>
+              <w:left w:val="single" w:sz="4" w:space="0" w:color="CBD5E1"/>
+              <w:bottom w:val="single" w:sz="4" w:space="0" w:color="CBD5E1"/>
+              <w:right w:val="single" w:sz="4" w:space="0" w:color="CBD5E1"/>
+              <w:insideH w:val="none"/>
+              <w:insideV w:val="none"/>
+            </w:tcBorders>
+            <w:shd w:fill="0D5C3A"/>
+          </w:tcPr>
+          <w:p>
+            <w:pPr>
+              <w:spacing w:before="40" w:after="40"/>
+            </w:pPr>
+            <w:r>
+              <w:rPr>
+                <w:rFonts w:ascii="Calibri" w:hAnsi="Calibri"/>
+                <w:b/>
+                <w:color w:val="FFFFFF"/>
+                <w:sz w:val="19"/>
+              </w:rPr>
+              <w:t>Primary Objectives &amp; Technical Scope</w:t>
+            </w:r>
+          </w:p>
+        </w:tc>
+        <w:tc>
+          <w:tcPr>
+            <w:tcW w:type="dxa" w:w="2412"/>
+            <w:tcMar>
+              <w:top w:w="100" w:type="dxa"/>
+              <w:bottom w:w="100" w:type="dxa"/>
+              <w:left w:w="140" w:type="dxa"/>
+              <w:right w:w="140" w:type="dxa"/>
+            </w:tcMar>
+            <w:tcBorders>
+              <w:top w:val="single" w:sz="4" w:space="0" w:color="CBD5E1"/>
+              <w:left w:val="single" w:sz="4" w:space="0" w:color="CBD5E1"/>
+              <w:bottom w:val="single" w:sz="4" w:space="0" w:color="CBD5E1"/>
+              <w:right w:val="single" w:sz="4" w:space="0" w:color="CBD5E1"/>
+              <w:insideH w:val="none"/>
+              <w:insideV w:val="none"/>
+            </w:tcBorders>
+            <w:shd w:fill="0D5C3A"/>
+          </w:tcPr>
+          <w:p>
+            <w:pPr>
+              <w:spacing w:before="40" w:after="40"/>
+            </w:pPr>
+            <w:r>
+              <w:rPr>
+                <w:rFonts w:ascii="Calibri" w:hAnsi="Calibri"/>
+                <w:b/>
+                <w:color w:val="FFFFFF"/>
+                <w:sz w:val="19"/>
+              </w:rPr>
+              <w:t>Target Deliverables</w:t>
+            </w:r>
+          </w:p>
+        </w:tc>
+        <w:tc>
+          <w:tcPr>
+            <w:tcW w:type="dxa" w:w="2412"/>
+            <w:tcMar>
+              <w:top w:w="100" w:type="dxa"/>
+              <w:bottom w:w="100" w:type="dxa"/>
+              <w:left w:w="140" w:type="dxa"/>
+              <w:right w:w="140" w:type="dxa"/>
+            </w:tcMar>
+            <w:tcBorders>
+              <w:top w:val="single" w:sz="4" w:space="0" w:color="CBD5E1"/>
+              <w:left w:val="single" w:sz="4" w:space="0" w:color="CBD5E1"/>
+              <w:bottom w:val="single" w:sz="4" w:space="0" w:color="CBD5E1"/>
+              <w:right w:val="single" w:sz="4" w:space="0" w:color="CBD5E1"/>
+              <w:insideH w:val="none"/>
+              <w:insideV w:val="none"/>
+            </w:tcBorders>
+            <w:shd w:fill="0D5C3A"/>
+          </w:tcPr>
+          <w:p>
+            <w:pPr>
+              <w:spacing w:before="40" w:after="40"/>
+            </w:pPr>
+            <w:r>
+              <w:rPr>
+                <w:rFonts w:ascii="Calibri" w:hAnsi="Calibri"/>
+                <w:b/>
+                <w:color w:val="FFFFFF"/>
+                <w:sz w:val="19"/>
+              </w:rPr>
+              <w:t>Current Status</w:t>
+            </w:r>
+          </w:p>
+        </w:tc>
+      </w:tr>
+      <w:tr>
+        <w:tc>
+          <w:tcPr>
+            <w:tcW w:type="dxa" w:w="2412"/>
+            <w:tcMar>
+              <w:top w:w="100" w:type="dxa"/>
+              <w:bottom w:w="100" w:type="dxa"/>
+              <w:left w:w="140" w:type="dxa"/>
+              <w:right w:w="140" w:type="dxa"/>
+            </w:tcMar>
+            <w:tcBorders>
+              <w:top w:val="single" w:sz="4" w:space="0" w:color="CBD5E1"/>
+              <w:left w:val="single" w:sz="4" w:space="0" w:color="CBD5E1"/>
+              <w:bottom w:val="single" w:sz="4" w:space="0" w:color="CBD5E1"/>
+              <w:right w:val="single" w:sz="4" w:space="0" w:color="CBD5E1"/>
+              <w:insideH w:val="none"/>
+              <w:insideV w:val="none"/>
+            </w:tcBorders>
+            <w:shd w:fill="F8FAFC"/>
+          </w:tcPr>
+          <w:p>
+            <w:pPr>
+              <w:spacing w:before="40" w:after="40"/>
+            </w:pPr>
+            <w:r>
+              <w:rPr>
+                <w:rFonts w:ascii="Calibri" w:hAnsi="Calibri"/>
+                <w:b/>
+                <w:color w:val="1F2937"/>
+                <w:sz w:val="18"/>
+              </w:rPr>
+              <w:t>Milestone 1: Foundations &amp; Architecture</w:t>
+            </w:r>
+          </w:p>
+        </w:tc>
+        <w:tc>
+          <w:tcPr>
+            <w:tcW w:type="dxa" w:w="2412"/>
+            <w:tcMar>
+              <w:top w:w="100" w:type="dxa"/>
+              <w:bottom w:w="100" w:type="dxa"/>
+              <w:left w:w="140" w:type="dxa"/>
+              <w:right w:w="140" w:type="dxa"/>
+            </w:tcMar>
+            <w:tcBorders>
+              <w:top w:val="single" w:sz="4" w:space="0" w:color="CBD5E1"/>
+              <w:left w:val="single" w:sz="4" w:space="0" w:color="CBD5E1"/>
+              <w:bottom w:val="single" w:sz="4" w:space="0" w:color="CBD5E1"/>
+              <w:right w:val="single" w:sz="4" w:space="0" w:color="CBD5E1"/>
+              <w:insideH w:val="none"/>
+              <w:insideV w:val="none"/>
+            </w:tcBorders>
+            <w:shd w:fill="F8FAFC"/>
+          </w:tcPr>
+          <w:p>
+            <w:pPr>
+              <w:spacing w:before="40" w:after="40"/>
+            </w:pPr>
+            <w:r>
+              <w:rPr>
+                <w:rFonts w:ascii="Calibri" w:hAnsi="Calibri"/>
+                <w:color w:val="1F2937"/>
+                <w:sz w:val="18"/>
+              </w:rPr>
+              <w:t>Problem formulation, feasibility studies, literature review, acquisition of ICAR/PlantVillage/Agmarknet datasets, and baseline data pipelines.</w:t>
+            </w:r>
+          </w:p>
+        </w:tc>
+        <w:tc>
+          <w:tcPr>
+            <w:tcW w:type="dxa" w:w="2412"/>
+            <w:tcMar>
+              <w:top w:w="100" w:type="dxa"/>
+              <w:bottom w:w="100" w:type="dxa"/>
+              <w:left w:w="140" w:type="dxa"/>
+              <w:right w:w="140" w:type="dxa"/>
+            </w:tcMar>
+            <w:tcBorders>
+              <w:top w:val="single" w:sz="4" w:space="0" w:color="CBD5E1"/>
+              <w:left w:val="single" w:sz="4" w:space="0" w:color="CBD5E1"/>
+              <w:bottom w:val="single" w:sz="4" w:space="0" w:color="CBD5E1"/>
+              <w:right w:val="single" w:sz="4" w:space="0" w:color="CBD5E1"/>
+              <w:insideH w:val="none"/>
+              <w:insideV w:val="none"/>
+            </w:tcBorders>
+            <w:shd w:fill="F8FAFC"/>
+          </w:tcPr>
+          <w:p>
+            <w:pPr>
+              <w:spacing w:before="40" w:after="40"/>
+            </w:pPr>
+            <w:r>
+              <w:rPr>
+                <w:rFonts w:ascii="Calibri" w:hAnsi="Calibri"/>
+                <w:color w:val="1F2937"/>
+                <w:sz w:val="18"/>
+              </w:rPr>
+              <w:t>Requirement specifications, feasibility matrix, raw datasets, data cleaning scripts.</w:t>
+            </w:r>
+          </w:p>
+        </w:tc>
+        <w:tc>
+          <w:tcPr>
+            <w:tcW w:type="dxa" w:w="2412"/>
+            <w:tcMar>
+              <w:top w:w="100" w:type="dxa"/>
+              <w:bottom w:w="100" w:type="dxa"/>
+              <w:left w:w="140" w:type="dxa"/>
+              <w:right w:w="140" w:type="dxa"/>
+            </w:tcMar>
+            <w:tcBorders>
+              <w:top w:val="single" w:sz="4" w:space="0" w:color="CBD5E1"/>
+              <w:left w:val="single" w:sz="4" w:space="0" w:color="CBD5E1"/>
+              <w:bottom w:val="single" w:sz="4" w:space="0" w:color="CBD5E1"/>
+              <w:right w:val="single" w:sz="4" w:space="0" w:color="CBD5E1"/>
+              <w:insideH w:val="none"/>
+              <w:insideV w:val="none"/>
+            </w:tcBorders>
+            <w:shd w:fill="F8FAFC"/>
+          </w:tcPr>
+          <w:p>
+            <w:pPr>
+              <w:spacing w:before="40" w:after="40"/>
+            </w:pPr>
+            <w:r>
+              <w:rPr>
+                <w:rFonts w:ascii="Calibri" w:hAnsi="Calibri"/>
+                <w:b/>
+                <w:color w:val="1F2937"/>
+                <w:sz w:val="18"/>
+              </w:rPr>
+              <w:t>100% Completed</w:t>
+            </w:r>
+          </w:p>
+        </w:tc>
+      </w:tr>
+      <w:tr>
+        <w:tc>
+          <w:tcPr>
+            <w:tcW w:type="dxa" w:w="2412"/>
+            <w:tcMar>
+              <w:top w:w="100" w:type="dxa"/>
+              <w:bottom w:w="100" w:type="dxa"/>
+              <w:left w:w="140" w:type="dxa"/>
+              <w:right w:w="140" w:type="dxa"/>
+            </w:tcMar>
+            <w:tcBorders>
+              <w:top w:val="single" w:sz="4" w:space="0" w:color="CBD5E1"/>
+              <w:left w:val="single" w:sz="4" w:space="0" w:color="CBD5E1"/>
+              <w:bottom w:val="single" w:sz="4" w:space="0" w:color="CBD5E1"/>
+              <w:right w:val="single" w:sz="4" w:space="0" w:color="CBD5E1"/>
+              <w:insideH w:val="none"/>
+              <w:insideV w:val="none"/>
+            </w:tcBorders>
+            <w:shd w:fill="FFFFFF"/>
+          </w:tcPr>
+          <w:p>
+            <w:pPr>
+              <w:spacing w:before="40" w:after="40"/>
+            </w:pPr>
+            <w:r>
+              <w:rPr>
+                <w:rFonts w:ascii="Calibri" w:hAnsi="Calibri"/>
+                <w:b/>
+                <w:color w:val="1F2937"/>
+                <w:sz w:val="18"/>
+              </w:rPr>
+              <w:t>Milestone 2: Core Modeling &amp; API Integration (Current Scope)</w:t>
+            </w:r>
+          </w:p>
+        </w:tc>
+        <w:tc>
+          <w:tcPr>
+            <w:tcW w:type="dxa" w:w="2412"/>
+            <w:tcMar>
+              <w:top w:w="100" w:type="dxa"/>
+              <w:bottom w:w="100" w:type="dxa"/>
+              <w:left w:w="140" w:type="dxa"/>
+              <w:right w:w="140" w:type="dxa"/>
+            </w:tcMar>
+            <w:tcBorders>
+              <w:top w:val="single" w:sz="4" w:space="0" w:color="CBD5E1"/>
+              <w:left w:val="single" w:sz="4" w:space="0" w:color="CBD5E1"/>
+              <w:bottom w:val="single" w:sz="4" w:space="0" w:color="CBD5E1"/>
+              <w:right w:val="single" w:sz="4" w:space="0" w:color="CBD5E1"/>
+              <w:insideH w:val="none"/>
+              <w:insideV w:val="none"/>
+            </w:tcBorders>
+            <w:shd w:fill="FFFFFF"/>
+          </w:tcPr>
+          <w:p>
+            <w:pPr>
+              <w:spacing w:before="40" w:after="40"/>
+            </w:pPr>
+            <w:r>
+              <w:rPr>
+                <w:rFonts w:ascii="Calibri" w:hAnsi="Calibri"/>
+                <w:color w:val="1F2937"/>
+                <w:sz w:val="18"/>
+              </w:rPr>
+              <w:t>Machine learning model training, temporal validation split, MobileNetV2 ONNX graph export, asynchronous FastAPI backend, and interactive React prototype.</w:t>
+            </w:r>
+          </w:p>
+        </w:tc>
+        <w:tc>
+          <w:tcPr>
+            <w:tcW w:type="dxa" w:w="2412"/>
+            <w:tcMar>
+              <w:top w:w="100" w:type="dxa"/>
+              <w:bottom w:w="100" w:type="dxa"/>
+              <w:left w:w="140" w:type="dxa"/>
+              <w:right w:w="140" w:type="dxa"/>
+            </w:tcMar>
+            <w:tcBorders>
+              <w:top w:val="single" w:sz="4" w:space="0" w:color="CBD5E1"/>
+              <w:left w:val="single" w:sz="4" w:space="0" w:color="CBD5E1"/>
+              <w:bottom w:val="single" w:sz="4" w:space="0" w:color="CBD5E1"/>
+              <w:right w:val="single" w:sz="4" w:space="0" w:color="CBD5E1"/>
+              <w:insideH w:val="none"/>
+              <w:insideV w:val="none"/>
+            </w:tcBorders>
+            <w:shd w:fill="FFFFFF"/>
+          </w:tcPr>
+          <w:p>
+            <w:pPr>
+              <w:spacing w:before="40" w:after="40"/>
+            </w:pPr>
+            <w:r>
+              <w:rPr>
+                <w:rFonts w:ascii="Calibri" w:hAnsi="Calibri"/>
+                <w:color w:val="1F2937"/>
+                <w:sz w:val="18"/>
+              </w:rPr>
+              <w:t>4 validated ML/DL models, 10 REST API endpoints, connected web UI dashboard, benchmark metrics.</w:t>
+            </w:r>
+          </w:p>
+        </w:tc>
+        <w:tc>
+          <w:tcPr>
+            <w:tcW w:type="dxa" w:w="2412"/>
+            <w:tcMar>
+              <w:top w:w="100" w:type="dxa"/>
+              <w:bottom w:w="100" w:type="dxa"/>
+              <w:left w:w="140" w:type="dxa"/>
+              <w:right w:w="140" w:type="dxa"/>
+            </w:tcMar>
+            <w:tcBorders>
+              <w:top w:val="single" w:sz="4" w:space="0" w:color="CBD5E1"/>
+              <w:left w:val="single" w:sz="4" w:space="0" w:color="CBD5E1"/>
+              <w:bottom w:val="single" w:sz="4" w:space="0" w:color="CBD5E1"/>
+              <w:right w:val="single" w:sz="4" w:space="0" w:color="CBD5E1"/>
+              <w:insideH w:val="none"/>
+              <w:insideV w:val="none"/>
+            </w:tcBorders>
+            <w:shd w:fill="FFFFFF"/>
+          </w:tcPr>
+          <w:p>
+            <w:pPr>
+              <w:spacing w:before="40" w:after="40"/>
+            </w:pPr>
+            <w:r>
+              <w:rPr>
+                <w:rFonts w:ascii="Calibri" w:hAnsi="Calibri"/>
+                <w:b/>
+                <w:color w:val="1F2937"/>
+                <w:sz w:val="18"/>
+              </w:rPr>
+              <w:t>Completed &amp; Under Evaluation (Current)</w:t>
+            </w:r>
+          </w:p>
+        </w:tc>
+      </w:tr>
+      <w:tr>
+        <w:tc>
+          <w:tcPr>
+            <w:tcW w:type="dxa" w:w="2412"/>
+            <w:tcMar>
+              <w:top w:w="100" w:type="dxa"/>
+              <w:bottom w:w="100" w:type="dxa"/>
+              <w:left w:w="140" w:type="dxa"/>
+              <w:right w:w="140" w:type="dxa"/>
+            </w:tcMar>
+            <w:tcBorders>
+              <w:top w:val="single" w:sz="4" w:space="0" w:color="CBD5E1"/>
+              <w:left w:val="single" w:sz="4" w:space="0" w:color="CBD5E1"/>
+              <w:bottom w:val="single" w:sz="4" w:space="0" w:color="CBD5E1"/>
+              <w:right w:val="single" w:sz="4" w:space="0" w:color="CBD5E1"/>
+              <w:insideH w:val="none"/>
+              <w:insideV w:val="none"/>
+            </w:tcBorders>
+            <w:shd w:fill="F8FAFC"/>
+          </w:tcPr>
+          <w:p>
+            <w:pPr>
+              <w:spacing w:before="40" w:after="40"/>
+            </w:pPr>
+            <w:r>
+              <w:rPr>
+                <w:rFonts w:ascii="Calibri" w:hAnsi="Calibri"/>
+                <w:b/>
+                <w:color w:val="1F2937"/>
+                <w:sz w:val="18"/>
+              </w:rPr>
+              <w:t>Milestone 3: Production Hardening &amp; Hardware IoT (Final Scope)</w:t>
+            </w:r>
+          </w:p>
+        </w:tc>
+        <w:tc>
+          <w:tcPr>
+            <w:tcW w:type="dxa" w:w="2412"/>
+            <w:tcMar>
+              <w:top w:w="100" w:type="dxa"/>
+              <w:bottom w:w="100" w:type="dxa"/>
+              <w:left w:w="140" w:type="dxa"/>
+              <w:right w:w="140" w:type="dxa"/>
+            </w:tcMar>
+            <w:tcBorders>
+              <w:top w:val="single" w:sz="4" w:space="0" w:color="CBD5E1"/>
+              <w:left w:val="single" w:sz="4" w:space="0" w:color="CBD5E1"/>
+              <w:bottom w:val="single" w:sz="4" w:space="0" w:color="CBD5E1"/>
+              <w:right w:val="single" w:sz="4" w:space="0" w:color="CBD5E1"/>
+              <w:insideH w:val="none"/>
+              <w:insideV w:val="none"/>
+            </w:tcBorders>
+            <w:shd w:fill="F8FAFC"/>
+          </w:tcPr>
+          <w:p>
+            <w:pPr>
+              <w:spacing w:before="40" w:after="40"/>
+            </w:pPr>
+            <w:r>
+              <w:rPr>
+                <w:rFonts w:ascii="Calibri" w:hAnsi="Calibri"/>
+                <w:color w:val="1F2937"/>
+                <w:sz w:val="18"/>
+              </w:rPr>
+              <w:t>Edge INT8 quantization, ESP32 IoT soil sensor telemetry streaming, live Agmarknet REST webhooks, bilingual TTS audio engine, and final field trials.</w:t>
+            </w:r>
+          </w:p>
+        </w:tc>
+        <w:tc>
+          <w:tcPr>
+            <w:tcW w:type="dxa" w:w="2412"/>
+            <w:tcMar>
+              <w:top w:w="100" w:type="dxa"/>
+              <w:bottom w:w="100" w:type="dxa"/>
+              <w:left w:w="140" w:type="dxa"/>
+              <w:right w:w="140" w:type="dxa"/>
+            </w:tcMar>
+            <w:tcBorders>
+              <w:top w:val="single" w:sz="4" w:space="0" w:color="CBD5E1"/>
+              <w:left w:val="single" w:sz="4" w:space="0" w:color="CBD5E1"/>
+              <w:bottom w:val="single" w:sz="4" w:space="0" w:color="CBD5E1"/>
+              <w:right w:val="single" w:sz="4" w:space="0" w:color="CBD5E1"/>
+              <w:insideH w:val="none"/>
+              <w:insideV w:val="none"/>
+            </w:tcBorders>
+            <w:shd w:fill="F8FAFC"/>
+          </w:tcPr>
+          <w:p>
+            <w:pPr>
+              <w:spacing w:before="40" w:after="40"/>
+            </w:pPr>
+            <w:r>
+              <w:rPr>
+                <w:rFonts w:ascii="Calibri" w:hAnsi="Calibri"/>
+                <w:color w:val="1F2937"/>
+                <w:sz w:val="18"/>
+              </w:rPr>
+              <w:t>INT8 quantized ONNX model, IoT serial ingestion bridge, live mandi polling service, bilingual speech synthesizer, final project report.</w:t>
+            </w:r>
+          </w:p>
+        </w:tc>
+        <w:tc>
+          <w:tcPr>
+            <w:tcW w:type="dxa" w:w="2412"/>
+            <w:tcMar>
+              <w:top w:w="100" w:type="dxa"/>
+              <w:bottom w:w="100" w:type="dxa"/>
+              <w:left w:w="140" w:type="dxa"/>
+              <w:right w:w="140" w:type="dxa"/>
+            </w:tcMar>
+            <w:tcBorders>
+              <w:top w:val="single" w:sz="4" w:space="0" w:color="CBD5E1"/>
+              <w:left w:val="single" w:sz="4" w:space="0" w:color="CBD5E1"/>
+              <w:bottom w:val="single" w:sz="4" w:space="0" w:color="CBD5E1"/>
+              <w:right w:val="single" w:sz="4" w:space="0" w:color="CBD5E1"/>
+              <w:insideH w:val="none"/>
+              <w:insideV w:val="none"/>
+            </w:tcBorders>
+            <w:shd w:fill="F8FAFC"/>
+          </w:tcPr>
+          <w:p>
+            <w:pPr>
+              <w:spacing w:before="40" w:after="40"/>
+            </w:pPr>
+            <w:r>
+              <w:rPr>
+                <w:rFonts w:ascii="Calibri" w:hAnsi="Calibri"/>
+                <w:b/>
+                <w:color w:val="1F2937"/>
+                <w:sz w:val="18"/>
+              </w:rPr>
+              <w:t>In Progress / Scheduled for Final Evaluation</w:t>
+            </w:r>
+          </w:p>
+        </w:tc>
+      </w:tr>
+    </w:tbl>
+    <w:p/>
+    <w:p>
+      <w:pPr>
+        <w:spacing w:before="80" w:after="120"/>
+      </w:pPr>
+      <w:r>
+        <w:rPr>
+          <w:color w:val="CBD5E1"/>
+        </w:rPr>
+        <w:t>━━━━━━━━━━━━━━━━━━━━━━━━━━━━━━━━━━━━━━━━━━━━━━━━━━━━━━━━━━━━</w:t>
+      </w:r>
+    </w:p>
+    <w:p>
+      <w:pPr>
         <w:pStyle w:val="Heading2"/>
         <w:spacing w:before="260" w:after="60"/>
       </w:pPr>
@@ -1267,7 +1970,7 @@
           <w:color w:val="1F2937"/>
           <w:sz w:val="21"/>
         </w:rPr>
-        <w:t>Through our field and laboratory research at Bennett University, our project team identified three interrelated bottlenecks that cripple farming productivity:</w:t>
+        <w:t>Through our laboratory research and field scoping at Bennett University, our project team identified three interrelated bottlenecks that cripple farming productivity:</w:t>
       </w:r>
     </w:p>
     <w:p>
@@ -1370,7 +2073,7 @@
           <w:color w:val="1F2937"/>
           <w:sz w:val="21"/>
         </w:rPr>
-        <w:t xml:space="preserve">To solve these systemic challenges, our engineering team designed and implemented </w:t>
+        <w:t xml:space="preserve">To solve these systemic challenges, our engineering team designed </w:t>
       </w:r>
       <w:r>
         <w:rPr>
@@ -1387,7 +2090,24 @@
           <w:color w:val="1F2937"/>
           <w:sz w:val="21"/>
         </w:rPr>
-        <w:t>: an end-to-end precision agriculture advisory ecosystem. SAGRI synthesizes four specialized machine learning and deep learning models into an intuitive, responsive web application served by an asynchronous Python FastAPI backend:</w:t>
+        <w:t xml:space="preserve"> as a modular precision agriculture advisory platform. Within the scope of </w:t>
+      </w:r>
+      <w:r>
+        <w:rPr>
+          <w:rFonts w:ascii="Calibri" w:hAnsi="Calibri"/>
+          <w:b/>
+          <w:color w:val="1F2937"/>
+          <w:sz w:val="21"/>
+        </w:rPr>
+        <w:t>Milestones 1 and 2</w:t>
+      </w:r>
+      <w:r>
+        <w:rPr>
+          <w:rFonts w:ascii="Calibri" w:hAnsi="Calibri"/>
+          <w:color w:val="1F2937"/>
+          <w:sz w:val="21"/>
+        </w:rPr>
+        <w:t>, our team successfully developed and integrated the core predictive intelligence modules into an asynchronous Python FastAPI backend connected to an interactive React dashboard:</w:t>
       </w:r>
     </w:p>
     <w:p>
@@ -1582,6 +2302,17 @@
           <w:sz w:val="20"/>
         </w:rPr>
         <w:t>).</w:t>
+      </w:r>
+    </w:p>
+    <w:p>
+      <w:r>
+        <w:rPr>
+          <w:rFonts w:ascii="Calibri" w:hAnsi="Calibri"/>
+          <w:i/>
+          <w:color w:val="1F2937"/>
+          <w:sz w:val="21"/>
+        </w:rPr>
+        <w:t>(Note: Advanced edge quantization, hardware IoT sensor telemetry, and live mandi webhooks are currently being engineered under the subsequent Milestone 3 final phase).</w:t>
       </w:r>
     </w:p>
     <w:p>
@@ -2159,7 +2890,7 @@
                 <w:color w:val="FFFFFF"/>
                 <w:sz w:val="19"/>
               </w:rPr>
-              <w:t>SAGRI (Our System)</w:t>
+              <w:t>SAGRI (Milestones 1 &amp; 2 Prototype)</w:t>
             </w:r>
           </w:p>
         </w:tc>
@@ -3169,7 +3900,7 @@
                 <w:color w:val="1F2937"/>
                 <w:sz w:val="18"/>
               </w:rPr>
-              <w:t>Full-Stack (FastAPI + React)</w:t>
+              <w:t>Full-Stack (FastAPI + React Prototype)</w:t>
             </w:r>
           </w:p>
         </w:tc>
@@ -3390,7 +4121,7 @@
           <w:color w:val="0F172A"/>
           <w:sz w:val="23"/>
         </w:rPr>
-        <w:t>2.3 Distinct Engineering Contributions of SAGRI</w:t>
+        <w:t>2.3 Distinct Engineering Contributions of SAGRI in Milestones 1 &amp; 2</w:t>
       </w:r>
     </w:p>
     <w:p>
@@ -3518,7 +4249,7 @@
           <w:color w:val="1F2937"/>
           <w:sz w:val="21"/>
         </w:rPr>
-        <w:t>Our team conducted a rigorous feasibility assessment across technical, economic, and operational dimensions before commencing full-stack implementation:</w:t>
+        <w:t>Our team conducted a rigorous feasibility assessment across technical, economic, and operational dimensions before commencing implementation:</w:t>
       </w:r>
     </w:p>
     <w:p>
@@ -3836,7 +4567,7 @@
           <w:color w:val="0F172A"/>
           <w:sz w:val="23"/>
         </w:rPr>
-        <w:t>4.1 Measurable Engineering Targets</w:t>
+        <w:t>4.1 Measurable Engineering Targets (Milestone 1 &amp; 2 Scope)</w:t>
       </w:r>
     </w:p>
     <w:tbl>
@@ -3917,7 +4648,7 @@
                 <w:color w:val="FFFFFF"/>
                 <w:sz w:val="19"/>
               </w:rPr>
-              <w:t>Quantitative KPI Target</w:t>
+              <w:t>Quantitative Target (M1 &amp; M2)</w:t>
             </w:r>
           </w:p>
         </w:tc>
@@ -3985,7 +4716,7 @@
                 <w:color w:val="FFFFFF"/>
                 <w:sz w:val="19"/>
               </w:rPr>
-              <w:t>Verification Status</w:t>
+              <w:t>Current Evaluation Status</w:t>
             </w:r>
           </w:p>
         </w:tc>
@@ -4139,7 +4870,7 @@
                 <w:color w:val="1F2937"/>
                 <w:sz w:val="18"/>
               </w:rPr>
-              <w:t>Validated</w:t>
+              <w:t>Validated in M2</w:t>
             </w:r>
           </w:p>
         </w:tc>
@@ -4310,7 +5041,7 @@
                 <w:color w:val="1F2937"/>
                 <w:sz w:val="18"/>
               </w:rPr>
-              <w:t>Validated</w:t>
+              <w:t>Validated in M2</w:t>
             </w:r>
           </w:p>
         </w:tc>
@@ -4464,7 +5195,7 @@
                 <w:color w:val="1F2937"/>
                 <w:sz w:val="18"/>
               </w:rPr>
-              <w:t>Validated</w:t>
+              <w:t>Validated in M2</w:t>
             </w:r>
           </w:p>
         </w:tc>
@@ -4610,7 +5341,7 @@
                 <w:color w:val="1F2937"/>
                 <w:sz w:val="18"/>
               </w:rPr>
-              <w:t>Validated</w:t>
+              <w:t>Validated in M2</w:t>
             </w:r>
           </w:p>
         </w:tc>
@@ -4756,7 +5487,7 @@
                 <w:color w:val="1F2937"/>
                 <w:sz w:val="18"/>
               </w:rPr>
-              <w:t>Validated</w:t>
+              <w:t>Validated in M2</w:t>
             </w:r>
           </w:p>
         </w:tc>
@@ -4775,7 +5506,7 @@
           <w:color w:val="0F172A"/>
           <w:sz w:val="23"/>
         </w:rPr>
-        <w:t>4.2 System Architecture Overview</w:t>
+        <w:t>4.2 System Architecture Overview (Current Milestone 2 Prototype)</w:t>
       </w:r>
     </w:p>
     <w:p>
@@ -4815,7 +5546,7 @@
         <w:t xml:space="preserve">    end</w:t>
         <w:br/>
         <w:br/>
-        <w:t xml:space="preserve">    subgraph ModelLayer["AI / ML Predictive Core"]</w:t>
+        <w:t xml:space="preserve">    subgraph ModelLayer["AI / ML Predictive Core (Milestone 2 Completed)"]</w:t>
         <w:br/>
         <w:t xml:space="preserve">        M1["Crop Recommendation&lt;br/&gt;(Random Forest Ensemble - 100 Trees)"]</w:t>
         <w:br/>
@@ -4888,7 +5619,7 @@
           <w:color w:val="0F172A"/>
           <w:sz w:val="23"/>
         </w:rPr>
-        <w:t>4.3 Five-Stage Engineering Methodology</w:t>
+        <w:t>4.3 Staged Engineering Methodology</w:t>
       </w:r>
     </w:p>
     <w:p>
@@ -4904,11 +5635,11 @@
         </w:rPr>
         <w:t>+---------------------------------------------------------------------------------------------------+</w:t>
         <w:br/>
-        <w:t>| STAGE 1: Agronomic Data Acquisition                                                               |</w:t>
+        <w:t>| MILESTONE 1: Agronomic Data Acquisition &amp; Curation (COMPLETED)                                    |</w:t>
         <w:br/>
         <w:t>| Harvested 2,200 ICAR soil records, 54,303 PlantVillage images, 325,418 ICRISAT climate records,    |</w:t>
         <w:br/>
-        <w:t>| and 19.4 MB of Agmarknet APMC mandi transaction records.                                          |</w:t>
+        <w:t>| and 19.4 MB of Agmarknet APMC mandi transaction records. Cleaned and structured datasets.        |</w:t>
         <w:br/>
         <w:t>+---------------------------------------------------------------------------------------------------+</w:t>
         <w:br/>
@@ -4918,11 +5649,11 @@
         <w:br/>
         <w:t>+---------------------------------------------------------------------------------------------------+</w:t>
         <w:br/>
-        <w:t>| STAGE 2: Feature Engineering &amp; Preprocessing                                                      |</w:t>
+        <w:t>| MILESTONE 1: Feature Engineering &amp; Baseline Design (COMPLETED)                                    |</w:t>
         <w:br/>
-        <w:t>| Normalized soil chemistry vectors; center-square cropped &amp; normalized leaf imagery to 224x224;    |</w:t>
+        <w:t>| Formulated 15-feature climate-yield matrix, normalized soil chemistry vectors, center-cropped     |</w:t>
         <w:br/>
-        <w:t>| created autoregressive price lag features; deflated raw prices using monthly WPI indices.          |</w:t>
+        <w:t>| leaf images to 224x224, and created WPI-deflated autoregressive market price features.            |</w:t>
         <w:br/>
         <w:t>+---------------------------------------------------------------------------------------------------+</w:t>
         <w:br/>
@@ -4932,11 +5663,11 @@
         <w:br/>
         <w:t>+---------------------------------------------------------------------------------------------------+</w:t>
         <w:br/>
-        <w:t>| STAGE 3: Model Training &amp; Rigorous Evaluation                                                     |</w:t>
+        <w:t>| MILESTONE 2: Model Training &amp; Out-of-Time Validation (COMPLETED - CURRENT EVALUATION)              |</w:t>
         <w:br/>
-        <w:t>| Trained Random Forest with Gini split; fine-tuned MobileNetV2 &amp; exported to ONNX graph;           |</w:t>
+        <w:t>| Trained 100-tree Random Forest (99.3%), fine-tuned MobileNetV2 &amp; exported to ONNX (96.8%),        |</w:t>
         <w:br/>
-        <w:t>| tuned regularized XGBoost with 1960-2012 vs 2013-2017 temporal validation split.                  |</w:t>
+        <w:t>| and trained regularized XGBoost with strict 1960-2012 vs 2013-2017 temporal split (0.892 ROC-AUC).|</w:t>
         <w:br/>
         <w:t>+---------------------------------------------------------------------------------------------------+</w:t>
         <w:br/>
@@ -4946,11 +5677,11 @@
         <w:br/>
         <w:t>+---------------------------------------------------------------------------------------------------+</w:t>
         <w:br/>
-        <w:t>| STAGE 4: Asynchronous REST Service Development                                                    |</w:t>
+        <w:t>| MILESTONE 2: Async REST API &amp; Interactive UI Integration (COMPLETED - CURRENT EVALUATION)         |</w:t>
         <w:br/>
-        <w:t>| Implemented FastAPI endpoints in backend/main.py with Pydantic type validation, CORS middleware,  |</w:t>
+        <w:t>| Implemented FastAPI asynchronous routing, Pydantic data models, in-memory model caching,          |</w:t>
         <w:br/>
-        <w:t>| and non-blocking in-memory inference pipelines.                                                   |</w:t>
+        <w:t>| and connected 20 modular React components on http://localhost:5173.                               |</w:t>
         <w:br/>
         <w:t>+---------------------------------------------------------------------------------------------------+</w:t>
         <w:br/>
@@ -4960,11 +5691,11 @@
         <w:br/>
         <w:t>+---------------------------------------------------------------------------------------------------+</w:t>
         <w:br/>
-        <w:t>| STAGE 5: Client Engineering &amp; User Verification                                                   |</w:t>
+        <w:t>| MILESTONE 3: Production Hardening, Edge Quantization &amp; IoT (IN PROGRESS - UPCOMING FINAL PHASE)   |</w:t>
         <w:br/>
-        <w:t>| Developed 20 responsive React components with dynamic Chart.js market curves, auto-filling        |</w:t>
+        <w:t>| Post-training INT8 quantization, ESP32 IoT soil sensor integration, real-time Agmarknet webhooks,  |</w:t>
         <w:br/>
-        <w:t>| state profiles, and sub-second diagnostic presentation.                                           |</w:t>
+        <w:t>| bilingual Hindi/English voice synthesis, and real-farm field deployment trials.                   |</w:t>
         <w:br/>
         <w:t>+---------------------------------------------------------------------------------------------------+</w:t>
       </w:r>
@@ -6697,7 +7428,7 @@
                 <w:color w:val="FFFFFF"/>
                 <w:sz w:val="19"/>
               </w:rPr>
-              <w:t>Verified Status</w:t>
+              <w:t>Current Status</w:t>
             </w:r>
           </w:p>
         </w:tc>
@@ -6866,6 +7597,14 @@
               </w:rPr>
               <w:t>200 OK</w:t>
             </w:r>
+            <w:r>
+              <w:rPr>
+                <w:rFonts w:ascii="Calibri" w:hAnsi="Calibri"/>
+                <w:color w:val="1F2937"/>
+                <w:sz w:val="18"/>
+              </w:rPr>
+              <w:t xml:space="preserve"> (M2 Prototype)</w:t>
+            </w:r>
           </w:p>
         </w:tc>
       </w:tr>
@@ -7032,6 +7771,14 @@
                 <w:sz w:val="16"/>
               </w:rPr>
               <w:t>200 OK</w:t>
+            </w:r>
+            <w:r>
+              <w:rPr>
+                <w:rFonts w:ascii="Calibri" w:hAnsi="Calibri"/>
+                <w:color w:val="1F2937"/>
+                <w:sz w:val="18"/>
+              </w:rPr>
+              <w:t xml:space="preserve"> (M2 Prototype)</w:t>
             </w:r>
           </w:p>
         </w:tc>
@@ -7200,6 +7947,14 @@
               </w:rPr>
               <w:t>200 OK</w:t>
             </w:r>
+            <w:r>
+              <w:rPr>
+                <w:rFonts w:ascii="Calibri" w:hAnsi="Calibri"/>
+                <w:color w:val="1F2937"/>
+                <w:sz w:val="18"/>
+              </w:rPr>
+              <w:t xml:space="preserve"> (M2 Prototype)</w:t>
+            </w:r>
           </w:p>
         </w:tc>
       </w:tr>
@@ -7366,6 +8121,14 @@
                 <w:sz w:val="16"/>
               </w:rPr>
               <w:t>200 OK</w:t>
+            </w:r>
+            <w:r>
+              <w:rPr>
+                <w:rFonts w:ascii="Calibri" w:hAnsi="Calibri"/>
+                <w:color w:val="1F2937"/>
+                <w:sz w:val="18"/>
+              </w:rPr>
+              <w:t xml:space="preserve"> (M2 Prototype)</w:t>
             </w:r>
           </w:p>
         </w:tc>
@@ -7534,6 +8297,14 @@
               </w:rPr>
               <w:t>200 OK</w:t>
             </w:r>
+            <w:r>
+              <w:rPr>
+                <w:rFonts w:ascii="Calibri" w:hAnsi="Calibri"/>
+                <w:color w:val="1F2937"/>
+                <w:sz w:val="18"/>
+              </w:rPr>
+              <w:t xml:space="preserve"> (M2 Prototype)</w:t>
+            </w:r>
           </w:p>
         </w:tc>
       </w:tr>
@@ -7700,6 +8471,14 @@
                 <w:sz w:val="16"/>
               </w:rPr>
               <w:t>200 OK</w:t>
+            </w:r>
+            <w:r>
+              <w:rPr>
+                <w:rFonts w:ascii="Calibri" w:hAnsi="Calibri"/>
+                <w:color w:val="1F2937"/>
+                <w:sz w:val="18"/>
+              </w:rPr>
+              <w:t xml:space="preserve"> (M2 Prototype)</w:t>
             </w:r>
           </w:p>
         </w:tc>
@@ -7868,6 +8647,14 @@
               </w:rPr>
               <w:t>200 OK</w:t>
             </w:r>
+            <w:r>
+              <w:rPr>
+                <w:rFonts w:ascii="Calibri" w:hAnsi="Calibri"/>
+                <w:color w:val="1F2937"/>
+                <w:sz w:val="18"/>
+              </w:rPr>
+              <w:t xml:space="preserve"> (M2 Prototype)</w:t>
+            </w:r>
           </w:p>
         </w:tc>
       </w:tr>
@@ -8034,6 +8821,14 @@
                 <w:sz w:val="16"/>
               </w:rPr>
               <w:t>200 OK</w:t>
+            </w:r>
+            <w:r>
+              <w:rPr>
+                <w:rFonts w:ascii="Calibri" w:hAnsi="Calibri"/>
+                <w:color w:val="1F2937"/>
+                <w:sz w:val="18"/>
+              </w:rPr>
+              <w:t xml:space="preserve"> (M2 Prototype)</w:t>
             </w:r>
           </w:p>
         </w:tc>
@@ -8202,6 +8997,14 @@
               </w:rPr>
               <w:t>200 OK</w:t>
             </w:r>
+            <w:r>
+              <w:rPr>
+                <w:rFonts w:ascii="Calibri" w:hAnsi="Calibri"/>
+                <w:color w:val="1F2937"/>
+                <w:sz w:val="18"/>
+              </w:rPr>
+              <w:t xml:space="preserve"> (M2 Prototype)</w:t>
+            </w:r>
           </w:p>
         </w:tc>
       </w:tr>
@@ -8369,6 +9172,14 @@
               </w:rPr>
               <w:t>200 OK</w:t>
             </w:r>
+            <w:r>
+              <w:rPr>
+                <w:rFonts w:ascii="Calibri" w:hAnsi="Calibri"/>
+                <w:color w:val="1F2937"/>
+                <w:sz w:val="18"/>
+              </w:rPr>
+              <w:t xml:space="preserve"> (M2 Prototype)</w:t>
+            </w:r>
           </w:p>
         </w:tc>
       </w:tr>
@@ -8397,7 +9208,7 @@
           <w:color w:val="0F172A"/>
           <w:sz w:val="23"/>
         </w:rPr>
-        <w:t>6.2 Running System Verification Proof</w:t>
+        <w:t>6.2 Running System Verification Proof (Milestone 2 Prototype)</w:t>
       </w:r>
     </w:p>
     <w:p>
@@ -8495,7 +9306,7 @@
           <w:color w:val="1E3A8A"/>
           <w:sz w:val="28"/>
         </w:rPr>
-        <w:t>7. Experimental Results &amp; Performance Benchmarks</w:t>
+        <w:t>7. Experimental Results &amp; Performance Benchmarks (Milestone 2 Validation)</w:t>
       </w:r>
     </w:p>
     <w:p>
@@ -8521,17 +9332,18 @@
         <w:tblLook w:firstColumn="1" w:firstRow="1" w:lastColumn="0" w:lastRow="0" w:noHBand="0" w:noVBand="1" w:val="04A0"/>
       </w:tblPr>
       <w:tblGrid>
-        <w:gridCol w:w="1608"/>
-        <w:gridCol w:w="1608"/>
-        <w:gridCol w:w="1608"/>
-        <w:gridCol w:w="1608"/>
-        <w:gridCol w:w="1608"/>
-        <w:gridCol w:w="1608"/>
+        <w:gridCol w:w="1378"/>
+        <w:gridCol w:w="1378"/>
+        <w:gridCol w:w="1378"/>
+        <w:gridCol w:w="1378"/>
+        <w:gridCol w:w="1378"/>
+        <w:gridCol w:w="1378"/>
+        <w:gridCol w:w="1378"/>
       </w:tblGrid>
       <w:tr>
         <w:tc>
           <w:tcPr>
-            <w:tcW w:type="dxa" w:w="1608"/>
+            <w:tcW w:type="dxa" w:w="1378"/>
             <w:tcMar>
               <w:top w:w="100" w:type="dxa"/>
               <w:bottom w:w="100" w:type="dxa"/>
@@ -8565,7 +9377,7 @@
         </w:tc>
         <w:tc>
           <w:tcPr>
-            <w:tcW w:type="dxa" w:w="1608"/>
+            <w:tcW w:type="dxa" w:w="1378"/>
             <w:tcMar>
               <w:top w:w="100" w:type="dxa"/>
               <w:bottom w:w="100" w:type="dxa"/>
@@ -8599,7 +9411,7 @@
         </w:tc>
         <w:tc>
           <w:tcPr>
-            <w:tcW w:type="dxa" w:w="1608"/>
+            <w:tcW w:type="dxa" w:w="1378"/>
             <w:tcMar>
               <w:top w:w="100" w:type="dxa"/>
               <w:bottom w:w="100" w:type="dxa"/>
@@ -8633,7 +9445,7 @@
         </w:tc>
         <w:tc>
           <w:tcPr>
-            <w:tcW w:type="dxa" w:w="1608"/>
+            <w:tcW w:type="dxa" w:w="1378"/>
             <w:tcMar>
               <w:top w:w="100" w:type="dxa"/>
               <w:bottom w:w="100" w:type="dxa"/>
@@ -8667,7 +9479,7 @@
         </w:tc>
         <w:tc>
           <w:tcPr>
-            <w:tcW w:type="dxa" w:w="1608"/>
+            <w:tcW w:type="dxa" w:w="1378"/>
             <w:tcMar>
               <w:top w:w="100" w:type="dxa"/>
               <w:bottom w:w="100" w:type="dxa"/>
@@ -8701,7 +9513,7 @@
         </w:tc>
         <w:tc>
           <w:tcPr>
-            <w:tcW w:type="dxa" w:w="1608"/>
+            <w:tcW w:type="dxa" w:w="1378"/>
             <w:tcMar>
               <w:top w:w="100" w:type="dxa"/>
               <w:bottom w:w="100" w:type="dxa"/>
@@ -8733,11 +9545,45 @@
             </w:r>
           </w:p>
         </w:tc>
+        <w:tc>
+          <w:tcPr>
+            <w:tcW w:type="dxa" w:w="1378"/>
+            <w:tcMar>
+              <w:top w:w="100" w:type="dxa"/>
+              <w:bottom w:w="100" w:type="dxa"/>
+              <w:left w:w="140" w:type="dxa"/>
+              <w:right w:w="140" w:type="dxa"/>
+            </w:tcMar>
+            <w:tcBorders>
+              <w:top w:val="single" w:sz="4" w:space="0" w:color="CBD5E1"/>
+              <w:left w:val="single" w:sz="4" w:space="0" w:color="CBD5E1"/>
+              <w:bottom w:val="single" w:sz="4" w:space="0" w:color="CBD5E1"/>
+              <w:right w:val="single" w:sz="4" w:space="0" w:color="CBD5E1"/>
+              <w:insideH w:val="none"/>
+              <w:insideV w:val="none"/>
+            </w:tcBorders>
+            <w:shd w:fill="0D5C3A"/>
+          </w:tcPr>
+          <w:p>
+            <w:pPr>
+              <w:spacing w:before="40" w:after="40"/>
+            </w:pPr>
+            <w:r>
+              <w:rPr>
+                <w:rFonts w:ascii="Calibri" w:hAnsi="Calibri"/>
+                <w:b/>
+                <w:color w:val="FFFFFF"/>
+                <w:sz w:val="19"/>
+              </w:rPr>
+              <w:t>Milestone Status</w:t>
+            </w:r>
+          </w:p>
+        </w:tc>
       </w:tr>
       <w:tr>
         <w:tc>
           <w:tcPr>
-            <w:tcW w:type="dxa" w:w="1608"/>
+            <w:tcW w:type="dxa" w:w="1378"/>
             <w:tcMar>
               <w:top w:w="100" w:type="dxa"/>
               <w:bottom w:w="100" w:type="dxa"/>
@@ -8771,7 +9617,7 @@
         </w:tc>
         <w:tc>
           <w:tcPr>
-            <w:tcW w:type="dxa" w:w="1608"/>
+            <w:tcW w:type="dxa" w:w="1378"/>
             <w:tcMar>
               <w:top w:w="100" w:type="dxa"/>
               <w:bottom w:w="100" w:type="dxa"/>
@@ -8804,7 +9650,7 @@
         </w:tc>
         <w:tc>
           <w:tcPr>
-            <w:tcW w:type="dxa" w:w="1608"/>
+            <w:tcW w:type="dxa" w:w="1378"/>
             <w:tcMar>
               <w:top w:w="100" w:type="dxa"/>
               <w:bottom w:w="100" w:type="dxa"/>
@@ -8837,7 +9683,7 @@
         </w:tc>
         <w:tc>
           <w:tcPr>
-            <w:tcW w:type="dxa" w:w="1608"/>
+            <w:tcW w:type="dxa" w:w="1378"/>
             <w:tcMar>
               <w:top w:w="100" w:type="dxa"/>
               <w:bottom w:w="100" w:type="dxa"/>
@@ -8871,7 +9717,7 @@
         </w:tc>
         <w:tc>
           <w:tcPr>
-            <w:tcW w:type="dxa" w:w="1608"/>
+            <w:tcW w:type="dxa" w:w="1378"/>
             <w:tcMar>
               <w:top w:w="100" w:type="dxa"/>
               <w:bottom w:w="100" w:type="dxa"/>
@@ -8905,7 +9751,7 @@
         </w:tc>
         <w:tc>
           <w:tcPr>
-            <w:tcW w:type="dxa" w:w="1608"/>
+            <w:tcW w:type="dxa" w:w="1378"/>
             <w:tcMar>
               <w:top w:w="100" w:type="dxa"/>
               <w:bottom w:w="100" w:type="dxa"/>
@@ -8936,11 +9782,45 @@
             </w:r>
           </w:p>
         </w:tc>
+        <w:tc>
+          <w:tcPr>
+            <w:tcW w:type="dxa" w:w="1378"/>
+            <w:tcMar>
+              <w:top w:w="100" w:type="dxa"/>
+              <w:bottom w:w="100" w:type="dxa"/>
+              <w:left w:w="140" w:type="dxa"/>
+              <w:right w:w="140" w:type="dxa"/>
+            </w:tcMar>
+            <w:tcBorders>
+              <w:top w:val="single" w:sz="4" w:space="0" w:color="CBD5E1"/>
+              <w:left w:val="single" w:sz="4" w:space="0" w:color="CBD5E1"/>
+              <w:bottom w:val="single" w:sz="4" w:space="0" w:color="CBD5E1"/>
+              <w:right w:val="single" w:sz="4" w:space="0" w:color="CBD5E1"/>
+              <w:insideH w:val="none"/>
+              <w:insideV w:val="none"/>
+            </w:tcBorders>
+            <w:shd w:fill="F8FAFC"/>
+          </w:tcPr>
+          <w:p>
+            <w:pPr>
+              <w:spacing w:before="40" w:after="40"/>
+            </w:pPr>
+            <w:r>
+              <w:rPr>
+                <w:rFonts w:ascii="Calibri" w:hAnsi="Calibri"/>
+                <w:b/>
+                <w:color w:val="1F2937"/>
+                <w:sz w:val="18"/>
+              </w:rPr>
+              <w:t>Validated (M2)</w:t>
+            </w:r>
+          </w:p>
+        </w:tc>
       </w:tr>
       <w:tr>
         <w:tc>
           <w:tcPr>
-            <w:tcW w:type="dxa" w:w="1608"/>
+            <w:tcW w:type="dxa" w:w="1378"/>
             <w:tcMar>
               <w:top w:w="100" w:type="dxa"/>
               <w:bottom w:w="100" w:type="dxa"/>
@@ -8974,7 +9854,7 @@
         </w:tc>
         <w:tc>
           <w:tcPr>
-            <w:tcW w:type="dxa" w:w="1608"/>
+            <w:tcW w:type="dxa" w:w="1378"/>
             <w:tcMar>
               <w:top w:w="100" w:type="dxa"/>
               <w:bottom w:w="100" w:type="dxa"/>
@@ -9007,7 +9887,7 @@
         </w:tc>
         <w:tc>
           <w:tcPr>
-            <w:tcW w:type="dxa" w:w="1608"/>
+            <w:tcW w:type="dxa" w:w="1378"/>
             <w:tcMar>
               <w:top w:w="100" w:type="dxa"/>
               <w:bottom w:w="100" w:type="dxa"/>
@@ -9040,7 +9920,7 @@
         </w:tc>
         <w:tc>
           <w:tcPr>
-            <w:tcW w:type="dxa" w:w="1608"/>
+            <w:tcW w:type="dxa" w:w="1378"/>
             <w:tcMar>
               <w:top w:w="100" w:type="dxa"/>
               <w:bottom w:w="100" w:type="dxa"/>
@@ -9074,7 +9954,7 @@
         </w:tc>
         <w:tc>
           <w:tcPr>
-            <w:tcW w:type="dxa" w:w="1608"/>
+            <w:tcW w:type="dxa" w:w="1378"/>
             <w:tcMar>
               <w:top w:w="100" w:type="dxa"/>
               <w:bottom w:w="100" w:type="dxa"/>
@@ -9108,7 +9988,7 @@
         </w:tc>
         <w:tc>
           <w:tcPr>
-            <w:tcW w:type="dxa" w:w="1608"/>
+            <w:tcW w:type="dxa" w:w="1378"/>
             <w:tcMar>
               <w:top w:w="100" w:type="dxa"/>
               <w:bottom w:w="100" w:type="dxa"/>
@@ -9139,11 +10019,45 @@
             </w:r>
           </w:p>
         </w:tc>
+        <w:tc>
+          <w:tcPr>
+            <w:tcW w:type="dxa" w:w="1378"/>
+            <w:tcMar>
+              <w:top w:w="100" w:type="dxa"/>
+              <w:bottom w:w="100" w:type="dxa"/>
+              <w:left w:w="140" w:type="dxa"/>
+              <w:right w:w="140" w:type="dxa"/>
+            </w:tcMar>
+            <w:tcBorders>
+              <w:top w:val="single" w:sz="4" w:space="0" w:color="CBD5E1"/>
+              <w:left w:val="single" w:sz="4" w:space="0" w:color="CBD5E1"/>
+              <w:bottom w:val="single" w:sz="4" w:space="0" w:color="CBD5E1"/>
+              <w:right w:val="single" w:sz="4" w:space="0" w:color="CBD5E1"/>
+              <w:insideH w:val="none"/>
+              <w:insideV w:val="none"/>
+            </w:tcBorders>
+            <w:shd w:fill="FFFFFF"/>
+          </w:tcPr>
+          <w:p>
+            <w:pPr>
+              <w:spacing w:before="40" w:after="40"/>
+            </w:pPr>
+            <w:r>
+              <w:rPr>
+                <w:rFonts w:ascii="Calibri" w:hAnsi="Calibri"/>
+                <w:b/>
+                <w:color w:val="1F2937"/>
+                <w:sz w:val="18"/>
+              </w:rPr>
+              <w:t>Validated (M2)</w:t>
+            </w:r>
+          </w:p>
+        </w:tc>
       </w:tr>
       <w:tr>
         <w:tc>
           <w:tcPr>
-            <w:tcW w:type="dxa" w:w="1608"/>
+            <w:tcW w:type="dxa" w:w="1378"/>
             <w:tcMar>
               <w:top w:w="100" w:type="dxa"/>
               <w:bottom w:w="100" w:type="dxa"/>
@@ -9177,7 +10091,7 @@
         </w:tc>
         <w:tc>
           <w:tcPr>
-            <w:tcW w:type="dxa" w:w="1608"/>
+            <w:tcW w:type="dxa" w:w="1378"/>
             <w:tcMar>
               <w:top w:w="100" w:type="dxa"/>
               <w:bottom w:w="100" w:type="dxa"/>
@@ -9210,7 +10124,7 @@
         </w:tc>
         <w:tc>
           <w:tcPr>
-            <w:tcW w:type="dxa" w:w="1608"/>
+            <w:tcW w:type="dxa" w:w="1378"/>
             <w:tcMar>
               <w:top w:w="100" w:type="dxa"/>
               <w:bottom w:w="100" w:type="dxa"/>
@@ -9243,7 +10157,7 @@
         </w:tc>
         <w:tc>
           <w:tcPr>
-            <w:tcW w:type="dxa" w:w="1608"/>
+            <w:tcW w:type="dxa" w:w="1378"/>
             <w:tcMar>
               <w:top w:w="100" w:type="dxa"/>
               <w:bottom w:w="100" w:type="dxa"/>
@@ -9277,7 +10191,7 @@
         </w:tc>
         <w:tc>
           <w:tcPr>
-            <w:tcW w:type="dxa" w:w="1608"/>
+            <w:tcW w:type="dxa" w:w="1378"/>
             <w:tcMar>
               <w:top w:w="100" w:type="dxa"/>
               <w:bottom w:w="100" w:type="dxa"/>
@@ -9311,7 +10225,7 @@
         </w:tc>
         <w:tc>
           <w:tcPr>
-            <w:tcW w:type="dxa" w:w="1608"/>
+            <w:tcW w:type="dxa" w:w="1378"/>
             <w:tcMar>
               <w:top w:w="100" w:type="dxa"/>
               <w:bottom w:w="100" w:type="dxa"/>
@@ -9342,11 +10256,45 @@
             </w:r>
           </w:p>
         </w:tc>
+        <w:tc>
+          <w:tcPr>
+            <w:tcW w:type="dxa" w:w="1378"/>
+            <w:tcMar>
+              <w:top w:w="100" w:type="dxa"/>
+              <w:bottom w:w="100" w:type="dxa"/>
+              <w:left w:w="140" w:type="dxa"/>
+              <w:right w:w="140" w:type="dxa"/>
+            </w:tcMar>
+            <w:tcBorders>
+              <w:top w:val="single" w:sz="4" w:space="0" w:color="CBD5E1"/>
+              <w:left w:val="single" w:sz="4" w:space="0" w:color="CBD5E1"/>
+              <w:bottom w:val="single" w:sz="4" w:space="0" w:color="CBD5E1"/>
+              <w:right w:val="single" w:sz="4" w:space="0" w:color="CBD5E1"/>
+              <w:insideH w:val="none"/>
+              <w:insideV w:val="none"/>
+            </w:tcBorders>
+            <w:shd w:fill="F8FAFC"/>
+          </w:tcPr>
+          <w:p>
+            <w:pPr>
+              <w:spacing w:before="40" w:after="40"/>
+            </w:pPr>
+            <w:r>
+              <w:rPr>
+                <w:rFonts w:ascii="Calibri" w:hAnsi="Calibri"/>
+                <w:b/>
+                <w:color w:val="1F2937"/>
+                <w:sz w:val="18"/>
+              </w:rPr>
+              <w:t>Validated (M2)</w:t>
+            </w:r>
+          </w:p>
+        </w:tc>
       </w:tr>
       <w:tr>
         <w:tc>
           <w:tcPr>
-            <w:tcW w:type="dxa" w:w="1608"/>
+            <w:tcW w:type="dxa" w:w="1378"/>
             <w:tcMar>
               <w:top w:w="100" w:type="dxa"/>
               <w:bottom w:w="100" w:type="dxa"/>
@@ -9380,7 +10328,7 @@
         </w:tc>
         <w:tc>
           <w:tcPr>
-            <w:tcW w:type="dxa" w:w="1608"/>
+            <w:tcW w:type="dxa" w:w="1378"/>
             <w:tcMar>
               <w:top w:w="100" w:type="dxa"/>
               <w:bottom w:w="100" w:type="dxa"/>
@@ -9413,7 +10361,7 @@
         </w:tc>
         <w:tc>
           <w:tcPr>
-            <w:tcW w:type="dxa" w:w="1608"/>
+            <w:tcW w:type="dxa" w:w="1378"/>
             <w:tcMar>
               <w:top w:w="100" w:type="dxa"/>
               <w:bottom w:w="100" w:type="dxa"/>
@@ -9446,7 +10394,7 @@
         </w:tc>
         <w:tc>
           <w:tcPr>
-            <w:tcW w:type="dxa" w:w="1608"/>
+            <w:tcW w:type="dxa" w:w="1378"/>
             <w:tcMar>
               <w:top w:w="100" w:type="dxa"/>
               <w:bottom w:w="100" w:type="dxa"/>
@@ -9480,7 +10428,7 @@
         </w:tc>
         <w:tc>
           <w:tcPr>
-            <w:tcW w:type="dxa" w:w="1608"/>
+            <w:tcW w:type="dxa" w:w="1378"/>
             <w:tcMar>
               <w:top w:w="100" w:type="dxa"/>
               <w:bottom w:w="100" w:type="dxa"/>
@@ -9514,7 +10462,7 @@
         </w:tc>
         <w:tc>
           <w:tcPr>
-            <w:tcW w:type="dxa" w:w="1608"/>
+            <w:tcW w:type="dxa" w:w="1378"/>
             <w:tcMar>
               <w:top w:w="100" w:type="dxa"/>
               <w:bottom w:w="100" w:type="dxa"/>
@@ -9545,6 +10493,40 @@
             </w:r>
           </w:p>
         </w:tc>
+        <w:tc>
+          <w:tcPr>
+            <w:tcW w:type="dxa" w:w="1378"/>
+            <w:tcMar>
+              <w:top w:w="100" w:type="dxa"/>
+              <w:bottom w:w="100" w:type="dxa"/>
+              <w:left w:w="140" w:type="dxa"/>
+              <w:right w:w="140" w:type="dxa"/>
+            </w:tcMar>
+            <w:tcBorders>
+              <w:top w:val="single" w:sz="4" w:space="0" w:color="CBD5E1"/>
+              <w:left w:val="single" w:sz="4" w:space="0" w:color="CBD5E1"/>
+              <w:bottom w:val="single" w:sz="4" w:space="0" w:color="CBD5E1"/>
+              <w:right w:val="single" w:sz="4" w:space="0" w:color="CBD5E1"/>
+              <w:insideH w:val="none"/>
+              <w:insideV w:val="none"/>
+            </w:tcBorders>
+            <w:shd w:fill="FFFFFF"/>
+          </w:tcPr>
+          <w:p>
+            <w:pPr>
+              <w:spacing w:before="40" w:after="40"/>
+            </w:pPr>
+            <w:r>
+              <w:rPr>
+                <w:rFonts w:ascii="Calibri" w:hAnsi="Calibri"/>
+                <w:b/>
+                <w:color w:val="1F2937"/>
+                <w:sz w:val="18"/>
+              </w:rPr>
+              <w:t>Validated (M2)</w:t>
+            </w:r>
+          </w:p>
+        </w:tc>
       </w:tr>
     </w:tbl>
     <w:p/>
@@ -9726,7 +10708,7 @@
           <w:color w:val="1F2937"/>
           <w:sz w:val="21"/>
         </w:rPr>
-        <w:t>To maintain technical excellence across all layers of the stack, the project team structured engineering responsibilities into three collaborative domain modules:</w:t>
+        <w:t>To maintain technical excellence across all layers of the stack throughout Milestones 1 and 2, the project team structured engineering responsibilities into three collaborative domain modules:</w:t>
       </w:r>
     </w:p>
     <w:p>
@@ -9972,17 +10954,7 @@
           <w:color w:val="1E3A8A"/>
           <w:sz w:val="28"/>
         </w:rPr>
-        <w:t>9. Conclusion &amp; Milestone 3 Technical Roadmap</w:t>
-      </w:r>
-    </w:p>
-    <w:p>
-      <w:r>
-        <w:rPr>
-          <w:rFonts w:ascii="Calibri" w:hAnsi="Calibri"/>
-          <w:color w:val="1F2937"/>
-          <w:sz w:val="21"/>
-        </w:rPr>
-        <w:t>During Milestones 1 and 2, our project team completed the domain literature review, curated authentic Indian agricultural datasets, trained four distinct machine learning and deep learning models, and integrated them into a fully operational web application.</w:t>
+        <w:t>9. Phased Project Status &amp; Milestone 3 Final Deliverables</w:t>
       </w:r>
     </w:p>
     <w:p>
@@ -9997,7 +10969,42 @@
           <w:color w:val="0F172A"/>
           <w:sz w:val="23"/>
         </w:rPr>
-        <w:t>Planned Milestone 3 Deliverables (Final Phase):</w:t>
+        <w:t>9.1 Summary of Milestones 1 &amp; 2 Completion (Current Evaluation Scope)</w:t>
+      </w:r>
+    </w:p>
+    <w:p>
+      <w:r>
+        <w:rPr>
+          <w:rFonts w:ascii="Calibri" w:hAnsi="Calibri"/>
+          <w:color w:val="1F2937"/>
+          <w:sz w:val="21"/>
+        </w:rPr>
+        <w:t>In Milestones 1 and 2, our team established the agronomic foundations, curated datasets from ICAR, PlantVillage, Agmarknet, and ICRISAT, trained four validated AI models, and integrated them into a functional full-stack web application running locally on port 5173 with a FastAPI backend on port 8000.</w:t>
+      </w:r>
+    </w:p>
+    <w:p>
+      <w:pPr>
+        <w:pStyle w:val="Heading3"/>
+        <w:spacing w:before="180" w:after="40"/>
+      </w:pPr>
+      <w:r>
+        <w:rPr>
+          <w:rFonts w:ascii="Calibri" w:hAnsi="Calibri"/>
+          <w:b/>
+          <w:color w:val="0F172A"/>
+          <w:sz w:val="23"/>
+        </w:rPr>
+        <w:t>9.2 In-Progress Work for Milestone 3 (Final Project Evaluation Scope)</w:t>
+      </w:r>
+    </w:p>
+    <w:p>
+      <w:r>
+        <w:rPr>
+          <w:rFonts w:ascii="Calibri" w:hAnsi="Calibri"/>
+          <w:color w:val="1F2937"/>
+          <w:sz w:val="21"/>
+        </w:rPr>
+        <w:t>Our team is actively executing the final development phase (Milestone 3) to advance SAGRI from a laboratory prototype to a production-hardened, hardware-integrated agricultural advisory ecosystem:</w:t>
       </w:r>
     </w:p>
     <w:p>
@@ -10020,7 +11027,22 @@
           <w:color w:val="1F2937"/>
           <w:sz w:val="20"/>
         </w:rPr>
-        <w:t>INT8 Quantization:</w:t>
+        <w:t>Edge INT8 Model Quantization:</w:t>
+      </w:r>
+    </w:p>
+    <w:p>
+      <w:pPr>
+        <w:pStyle w:val="ListBullet"/>
+        <w:spacing w:after="40"/>
+      </w:pPr>
+      <w:r>
+        <w:rPr>
+          <w:rFonts w:ascii="Calibri" w:hAnsi="Calibri"/>
+          <w:i/>
+          <w:color w:val="1F2937"/>
+          <w:sz w:val="20"/>
+        </w:rPr>
+        <w:t>Objective:</w:t>
       </w:r>
       <w:r>
         <w:rPr>
@@ -10028,7 +11050,7 @@
           <w:color w:val="1F2937"/>
           <w:sz w:val="20"/>
         </w:rPr>
-        <w:t xml:space="preserve"> Apply post-training INT8 quantization to </w:t>
+        <w:t xml:space="preserve"> Convert </w:t>
       </w:r>
       <w:r>
         <w:rPr>
@@ -10044,7 +11066,30 @@
           <w:color w:val="1F2937"/>
           <w:sz w:val="20"/>
         </w:rPr>
-        <w:t>, reducing model storage footprint from 16 MB to under 5 MB for ultra-fast edge execution.</w:t>
+        <w:t xml:space="preserve"> from 32-bit floating point (FP32) to 8-bit integer (INT8) quantization using ONNX Runtime Quantization Tools.</w:t>
+      </w:r>
+    </w:p>
+    <w:p>
+      <w:pPr>
+        <w:pStyle w:val="ListBullet"/>
+        <w:spacing w:after="40"/>
+      </w:pPr>
+      <w:r>
+        <w:rPr>
+          <w:rFonts w:ascii="Calibri" w:hAnsi="Calibri"/>
+          <w:i/>
+          <w:color w:val="1F2937"/>
+          <w:sz w:val="20"/>
+        </w:rPr>
+        <w:t>Target KPI:</w:t>
+      </w:r>
+      <w:r>
+        <w:rPr>
+          <w:rFonts w:ascii="Calibri" w:hAnsi="Calibri"/>
+          <w:color w:val="1F2937"/>
+          <w:sz w:val="20"/>
+        </w:rPr>
+        <w:t xml:space="preserve"> Reduce model file size from 16 MB to under 5 MB, cutting CPU inference latency from 112 ms down to under 50 ms for low-power edge devices.</w:t>
       </w:r>
     </w:p>
     <w:p>
@@ -10067,7 +11112,22 @@
           <w:color w:val="1F2937"/>
           <w:sz w:val="20"/>
         </w:rPr>
-        <w:t>IoT Telemetry Ingestion:</w:t>
+        <w:t>ESP32 IoT Soil Telemetry Ingestion Bridge:</w:t>
+      </w:r>
+    </w:p>
+    <w:p>
+      <w:pPr>
+        <w:pStyle w:val="ListBullet"/>
+        <w:spacing w:after="40"/>
+      </w:pPr>
+      <w:r>
+        <w:rPr>
+          <w:rFonts w:ascii="Calibri" w:hAnsi="Calibri"/>
+          <w:i/>
+          <w:color w:val="1F2937"/>
+          <w:sz w:val="20"/>
+        </w:rPr>
+        <w:t>Objective:</w:t>
       </w:r>
       <w:r>
         <w:rPr>
@@ -10075,7 +11135,7 @@
           <w:color w:val="1F2937"/>
           <w:sz w:val="20"/>
         </w:rPr>
-        <w:t xml:space="preserve"> Interface an ESP32 microcontroller with capacitive NPK/moisture soil probes to stream real-time sensor readings directly into </w:t>
+        <w:t xml:space="preserve"> Connect physical capacitive NPK, moisture, and soil temperature probes via an ESP32 microcontroller over MQTT/HTTP to stream live farm field readings directly into </w:t>
       </w:r>
       <w:r>
         <w:rPr>
@@ -10091,7 +11151,7 @@
           <w:color w:val="1F2937"/>
           <w:sz w:val="20"/>
         </w:rPr>
-        <w:t>.</w:t>
+        <w:t>, bypassing manual data entry.</w:t>
       </w:r>
     </w:p>
     <w:p>
@@ -10114,7 +11174,22 @@
           <w:color w:val="1F2937"/>
           <w:sz w:val="20"/>
         </w:rPr>
-        <w:t>Vernacular Audio Synthesizer:</w:t>
+        <w:t>Live Agmarknet APMC Real-Time Webhook Pipeline:</w:t>
+      </w:r>
+    </w:p>
+    <w:p>
+      <w:pPr>
+        <w:pStyle w:val="ListBullet"/>
+        <w:spacing w:after="40"/>
+      </w:pPr>
+      <w:r>
+        <w:rPr>
+          <w:rFonts w:ascii="Calibri" w:hAnsi="Calibri"/>
+          <w:i/>
+          <w:color w:val="1F2937"/>
+          <w:sz w:val="20"/>
+        </w:rPr>
+        <w:t>Objective:</w:t>
       </w:r>
       <w:r>
         <w:rPr>
@@ -10122,7 +11197,7 @@
           <w:color w:val="1F2937"/>
           <w:sz w:val="20"/>
         </w:rPr>
-        <w:t xml:space="preserve"> Integrate bilingual text-to-speech (Hindi and English) to ensure accessibility for low-literacy rural farmers.</w:t>
+        <w:t xml:space="preserve"> Establish automated daily webhook polling against the national Agmarknet data API to ingest live commodity spot prices, automatically updating the forecasting models with real-time arrivals.</w:t>
       </w:r>
     </w:p>
     <w:p>
@@ -10145,7 +11220,22 @@
           <w:color w:val="1F2937"/>
           <w:sz w:val="20"/>
         </w:rPr>
-        <w:t>Live Mandi Webhook Feeds:</w:t>
+        <w:t>Multilingual Vernacular Audio Advisory Engine:</w:t>
+      </w:r>
+    </w:p>
+    <w:p>
+      <w:pPr>
+        <w:pStyle w:val="ListBullet"/>
+        <w:spacing w:after="40"/>
+      </w:pPr>
+      <w:r>
+        <w:rPr>
+          <w:rFonts w:ascii="Calibri" w:hAnsi="Calibri"/>
+          <w:i/>
+          <w:color w:val="1F2937"/>
+          <w:sz w:val="20"/>
+        </w:rPr>
+        <w:t>Objective:</w:t>
       </w:r>
       <w:r>
         <w:rPr>
@@ -10153,7 +11243,53 @@
           <w:color w:val="1F2937"/>
           <w:sz w:val="20"/>
         </w:rPr>
-        <w:t xml:space="preserve"> Ingest daily live APMC price arrivals via official Agmarknet REST webhooks to augment historical forecasting curves.</w:t>
+        <w:t xml:space="preserve"> Integrate bilingual text-to-speech (Hindi and English) audio generation to vocalize crop recommendations, risk advisories, and pathological treatments for low-literacy farmers.</w:t>
+      </w:r>
+    </w:p>
+    <w:p>
+      <w:pPr>
+        <w:spacing w:after="50"/>
+        <w:ind w:left="504" w:hanging="504"/>
+      </w:pPr>
+      <w:r>
+        <w:rPr>
+          <w:rFonts w:ascii="Calibri" w:hAnsi="Calibri"/>
+          <w:b/>
+          <w:color w:val="0D5C3A"/>
+        </w:rPr>
+        <w:t xml:space="preserve">5. </w:t>
+      </w:r>
+      <w:r>
+        <w:rPr>
+          <w:rFonts w:ascii="Calibri" w:hAnsi="Calibri"/>
+          <w:b/>
+          <w:color w:val="1F2937"/>
+          <w:sz w:val="20"/>
+        </w:rPr>
+        <w:t>Pilot Field Testing &amp; Comprehensive Final Defense:</w:t>
+      </w:r>
+    </w:p>
+    <w:p>
+      <w:pPr>
+        <w:pStyle w:val="ListBullet"/>
+        <w:spacing w:after="40"/>
+      </w:pPr>
+      <w:r>
+        <w:rPr>
+          <w:rFonts w:ascii="Calibri" w:hAnsi="Calibri"/>
+          <w:i/>
+          <w:color w:val="1F2937"/>
+          <w:sz w:val="20"/>
+        </w:rPr>
+        <w:t>Objective:</w:t>
+      </w:r>
+      <w:r>
+        <w:rPr>
+          <w:rFonts w:ascii="Calibri" w:hAnsi="Calibri"/>
+          <w:color w:val="1F2937"/>
+          <w:sz w:val="20"/>
+        </w:rPr>
+        <w:t xml:space="preserve"> Conduct end-to-end user validation with local farming cooperative test cases and present the finalized production ecosystem during the final Milestone 3 evaluation.</w:t>
       </w:r>
     </w:p>
     <w:p>

</xml_diff>